<commit_message>
Fill in author name on the conference paper
Author: Joshua Ojoagefu Okpanachi. Second author/supervisor slot left
as a placeholder for now, per instruction.
</commit_message>
<xml_diff>
--- a/TigerNut_Conference_Paper.docx
+++ b/TigerNut_Conference_Paper.docx
@@ -29,7 +29,7 @@
           <w:sz w:val="21"/>
           <w:szCs w:val="21"/>
         </w:rPr>
-        <w:t xml:space="preserve">[Author Name]</w:t>
+        <w:t xml:space="preserve">Joshua Ojoagefu Okpanachi</w:t>
       </w:r>
       <w:r>
         <w:rPr>
@@ -3748,7 +3748,7 @@
           <w:sz w:val="18"/>
           <w:szCs w:val="18"/>
         </w:rPr>
-        <w:t xml:space="preserve">4. [Author Name]: AI-Powered Tiger Nut Sorting System for Packaging — Chapter Four: Results and Discussion. Undergraduate project report, Department of Mechanical/Mechatronics Engineering, Adeleke University (2026). Unpublished.</w:t>
+        <w:t xml:space="preserve">4. Okpanachi, J.O.: AI-Powered Tiger Nut Sorting System for Packaging — Chapter Four: Results and Discussion. Undergraduate project report, Department of Mechanical/Mechatronics Engineering, Adeleke University (2026). Unpublished.</w:t>
       </w:r>
     </w:p>
     <w:p>

</xml_diff>

<commit_message>
Fix university name: FUTMinna, not Adeleke University
The affiliation lines and reference [4] had carried over Adeleke
University from an earlier, unrelated paper's template by mistake.
Corrected to Federal University of Technology, Minna (FUTMinna) in
both author affiliation lines and the corresponding-author email
placeholder domain.
</commit_message>
<xml_diff>
--- a/TigerNut_Conference_Paper.docx
+++ b/TigerNut_Conference_Paper.docx
@@ -71,7 +71,7 @@
           <w:sz w:val="18"/>
           <w:szCs w:val="18"/>
         </w:rPr>
-        <w:t xml:space="preserve">1 Department of Mechanical/Mechatronics Engineering, Adeleke University, Ede, Nigeria</w:t>
+        <w:t xml:space="preserve">1 Department of Mechanical/Mechatronics Engineering, Federal University of Technology, Minna, Nigeria</w:t>
       </w:r>
     </w:p>
     <w:p>
@@ -87,7 +87,7 @@
           <w:sz w:val="18"/>
           <w:szCs w:val="18"/>
         </w:rPr>
-        <w:t xml:space="preserve">2 [Department], Adeleke University, Ede, Nigeria</w:t>
+        <w:t xml:space="preserve">2 [Department], Federal University of Technology, Minna, Nigeria</w:t>
       </w:r>
     </w:p>
     <w:p>
@@ -103,7 +103,7 @@
           <w:sz w:val="18"/>
           <w:szCs w:val="18"/>
         </w:rPr>
-        <w:t xml:space="preserve">* Corresponding author: [email@adelekeuniversity.edu.ng]</w:t>
+        <w:t xml:space="preserve">* Corresponding author: [email@futminna.edu.ng]</w:t>
       </w:r>
     </w:p>
     <w:p>
@@ -3748,7 +3748,7 @@
           <w:sz w:val="18"/>
           <w:szCs w:val="18"/>
         </w:rPr>
-        <w:t xml:space="preserve">4. Okpanachi, J.O.: AI-Powered Tiger Nut Sorting System for Packaging — Chapter Four: Results and Discussion. Undergraduate project report, Department of Mechanical/Mechatronics Engineering, Adeleke University (2026). Unpublished.</w:t>
+        <w:t xml:space="preserve">4. Okpanachi, J.O.: AI-Powered Tiger Nut Sorting System for Packaging — Chapter Four: Results and Discussion. Undergraduate project report, Department of Mechanical/Mechatronics Engineering, Federal University of Technology, Minna (2026). Unpublished.</w:t>
       </w:r>
     </w:p>
     <w:p>

</xml_diff>

<commit_message>
Fix department: Computer Engineering, not Mechanical/Mechatronics
Another carry-over from the unrelated PSO-ANFIS paper template.
</commit_message>
<xml_diff>
--- a/TigerNut_Conference_Paper.docx
+++ b/TigerNut_Conference_Paper.docx
@@ -71,7 +71,7 @@
           <w:sz w:val="18"/>
           <w:szCs w:val="18"/>
         </w:rPr>
-        <w:t xml:space="preserve">1 Department of Mechanical/Mechatronics Engineering, Federal University of Technology, Minna, Nigeria</w:t>
+        <w:t xml:space="preserve">1 Department of Computer Engineering, Federal University of Technology, Minna, Nigeria</w:t>
       </w:r>
     </w:p>
     <w:p>
@@ -3748,7 +3748,7 @@
           <w:sz w:val="18"/>
           <w:szCs w:val="18"/>
         </w:rPr>
-        <w:t xml:space="preserve">4. Okpanachi, J.O.: AI-Powered Tiger Nut Sorting System for Packaging — Chapter Four: Results and Discussion. Undergraduate project report, Department of Mechanical/Mechatronics Engineering, Federal University of Technology, Minna (2026). Unpublished.</w:t>
+        <w:t xml:space="preserve">4. Okpanachi, J.O.: AI-Powered Tiger Nut Sorting System for Packaging — Chapter Four: Results and Discussion. Undergraduate project report, Department of Computer Engineering, Federal University of Technology, Minna (2026). Unpublished.</w:t>
       </w:r>
     </w:p>
     <w:p>

</xml_diff>